<commit_message>
Fix overlapping chart labels and diagram layout
</commit_message>
<xml_diff>
--- a/Info 200 Team Ass Filled Draft.docx
+++ b/Info 200 Team Ass Filled Draft.docx
@@ -1686,7 +1686,7 @@
       <w:r>
         <w:drawing>
           <wp:inline xmlns:a="http://schemas.openxmlformats.org/drawingml/2006/main" xmlns:pic="http://schemas.openxmlformats.org/drawingml/2006/picture">
-            <wp:extent cx="5669280" cy="3066676"/>
+            <wp:extent cx="5669280" cy="3002712"/>
             <wp:docPr id="2" name="Picture 2"/>
             <wp:cNvGraphicFramePr>
               <a:graphicFrameLocks noChangeAspect="1"/>
@@ -1707,7 +1707,7 @@
                   <pic:spPr>
                     <a:xfrm>
                       <a:off x="0" y="0"/>
-                      <a:ext cx="5669280" cy="3066676"/>
+                      <a:ext cx="5669280" cy="3002712"/>
                     </a:xfrm>
                     <a:prstGeom prst="rect"/>
                   </pic:spPr>
@@ -2254,7 +2254,7 @@
       <w:r>
         <w:drawing>
           <wp:inline xmlns:a="http://schemas.openxmlformats.org/drawingml/2006/main" xmlns:pic="http://schemas.openxmlformats.org/drawingml/2006/picture">
-            <wp:extent cx="5669280" cy="3525321"/>
+            <wp:extent cx="5669280" cy="3424898"/>
             <wp:docPr id="4" name="Picture 4"/>
             <wp:cNvGraphicFramePr>
               <a:graphicFrameLocks noChangeAspect="1"/>
@@ -2275,7 +2275,7 @@
                   <pic:spPr>
                     <a:xfrm>
                       <a:off x="0" y="0"/>
-                      <a:ext cx="5669280" cy="3525321"/>
+                      <a:ext cx="5669280" cy="3424898"/>
                     </a:xfrm>
                     <a:prstGeom prst="rect"/>
                   </pic:spPr>

</xml_diff>